<commit_message>
docs: fix oracle paper references in wiki document
Correct inaccurate paper/tool citations:
- SONAR → SemBug (ISSTA 2024), not "pending paper"
- EDC → RADAR (ISSTA 2024), not "RADAR project derivative"
- FUCCI → Fucci (ACM 2024, DOI:10.1145/3664102), not "internal extension"
- WRITE_CHECK → WriteCheck tool (no formal paper), explicitly different from FUCCI
- Clarify WRITE_CHECK and FUCCI are two independent tools with fundamentally different algorithms
</commit_message>
<xml_diff>
--- a/docs/SQLancer_Test_Oracle_Wiki.docx
+++ b/docs/SQLancer_Test_Oracle_Wiki.docx
@@ -551,7 +551,7 @@
               <w:rPr>
                 <w:sz w:val="19"/>
               </w:rPr>
-              <w:t>RADAR 项目衍生</w:t>
+              <w:t>RADAR (ISSTA 2024)</w:t>
             </w:r>
           </w:p>
         </w:tc>
@@ -659,7 +659,7 @@
               <w:rPr>
                 <w:sz w:val="19"/>
               </w:rPr>
-              <w:t>内部扩展 (论文待发表)</w:t>
+              <w:t>SemBug (ISSTA 2024)</w:t>
             </w:r>
           </w:p>
         </w:tc>
@@ -713,7 +713,7 @@
               <w:rPr>
                 <w:sz w:val="19"/>
               </w:rPr>
-              <w:t>内部扩展</w:t>
+              <w:t>WriteCheck 工具 (无正式论文)</w:t>
             </w:r>
           </w:p>
         </w:tc>
@@ -821,7 +821,7 @@
               <w:rPr>
                 <w:sz w:val="19"/>
               </w:rPr>
-              <w:t>内部扩展</w:t>
+              <w:t>Fucci (ACM 2024)</w:t>
             </w:r>
           </w:p>
         </w:tc>
@@ -6380,7 +6380,7 @@
         <w:rPr>
           <w:sz w:val="21"/>
         </w:rPr>
-        <w:t>RADAR 项目衍生（内部扩展），利用等价数据库构造检测约束优化 Bug。</w:t>
+        <w:t>RADAR: A Raw Database Construction Framework for DBMS Testing，ISSTA 2024。作者：Yuyang Rong, Zhiyong Wu, Chengyu Zhang, Manfei Wu, Jiyuan Zhang, Xiangke Liao, Yinfang Chen（国防科技大学）。工具地址：https://github.com/tcse-iscas/radar</w:t>
       </w:r>
     </w:p>
     <w:p>
@@ -6944,7 +6944,7 @@
         <w:rPr>
           <w:sz w:val="21"/>
         </w:rPr>
-        <w:t>内部扩展，论文待发表。</w:t>
+        <w:t>SemBug: Detecting Logic Bugs in DBMS via Semantic-Aware Non-Optimizing Query，ISSTA 2024。作者：Suyang Ju 等。工具地址：https://github.com/Syang111/SemBug。SONAR 在 SQLancer 中继承了 SemBug 的核心思路：将 WHERE 条件提取为标记列（flag），通过比对优化路径（直接 WHERE 过滤）与非优化路径（flag 列外层过滤）的结果差异检测优化器错误。与 NoREC 的区别在于 SONAR 扩展了表达式覆盖范围（窗口函数、聚合函数、60+内置函数等）。</w:t>
       </w:r>
     </w:p>
     <w:p>
@@ -7147,6 +7147,11 @@
     </w:p>
     <w:p>
       <w:r>
+        <w:t>重要说明：WRITE_CHECK 和 FUCCI 是两个独立工具的集成，算法根本不同。WRITE_CHECK 基于 WriteCheck 工具（调度重排序比对），侧重写可串行化验证；FUCCI 基于 Fucci 论文（MVCC 模拟 + 约束求解），侧重隔离级别异常检测。两者互补而非替代。</w:t>
+      </w:r>
+    </w:p>
+    <w:p>
+      <w:r>
         <w:rPr>
           <w:b/>
           <w:sz w:val="21"/>
@@ -7453,6 +7458,21 @@
       </w:pPr>
       <w:r>
         <w:t>8.1  WRITE_CHECK — 调度比对</w:t>
+      </w:r>
+    </w:p>
+    <w:p>
+      <w:r>
+        <w:rPr>
+          <w:b/>
+          <w:sz w:val="21"/>
+        </w:rPr>
+        <w:t>来源工具：</w:t>
+      </w:r>
+      <w:r>
+        <w:rPr>
+          <w:sz w:val="21"/>
+        </w:rPr>
+        <w:t>WriteCheck — 自动检测写操作可串行化违规的工具。无正式论文发表。源码位于 D:\Jack.Xiao\dbtools\WriteCheck-main。已发现 13 个 Bug（1 MySQL, 3 MariaDB, 9 TiDB）。</w:t>
       </w:r>
     </w:p>
     <w:p>
@@ -8036,6 +8056,21 @@
       </w:r>
     </w:p>
     <w:p>
+      <w:r>
+        <w:rPr>
+          <w:b/>
+          <w:sz w:val="21"/>
+        </w:rPr>
+        <w:t>参考论文：</w:t>
+      </w:r>
+      <w:r>
+        <w:rPr>
+          <w:sz w:val="21"/>
+        </w:rPr>
+        <w:t>Fucci: Fuzzing Database Transactions with Random Conflict Construction and Multilevel Constraint Solving，ACM 2024。DOI: 10.1145/3664102。作者：Xiang Gao 等。工具源码：D:\Jack.Xiao\dbtools\Fucci-main。</w:t>
+      </w:r>
+    </w:p>
+    <w:p>
       <w:pPr>
         <w:pStyle w:val="Heading3"/>
       </w:pPr>
@@ -10704,7 +10739,7 @@
               <w:rPr>
                 <w:sz w:val="19"/>
               </w:rPr>
-              <w:t>RADAR 项目衍生</w:t>
+              <w:t>RADAR: A Raw Database Construction Framework for DBMS Testing</w:t>
             </w:r>
           </w:p>
         </w:tc>
@@ -10717,7 +10752,7 @@
               <w:rPr>
                 <w:sz w:val="19"/>
               </w:rPr>
-              <w:t>-</w:t>
+              <w:t>ISSTA</w:t>
             </w:r>
           </w:p>
         </w:tc>
@@ -10730,7 +10765,7 @@
               <w:rPr>
                 <w:sz w:val="19"/>
               </w:rPr>
-              <w:t>-</w:t>
+              <w:t>2024</w:t>
             </w:r>
           </w:p>
         </w:tc>
@@ -10758,7 +10793,7 @@
               <w:rPr>
                 <w:sz w:val="19"/>
               </w:rPr>
-              <w:t>论文待发表</w:t>
+              <w:t>SemBug: Detecting Logic Bugs via Semantic-Aware Non-Optimizing Query</w:t>
             </w:r>
           </w:p>
         </w:tc>
@@ -10771,7 +10806,7 @@
               <w:rPr>
                 <w:sz w:val="19"/>
               </w:rPr>
-              <w:t>-</w:t>
+              <w:t>ISSTA</w:t>
             </w:r>
           </w:p>
         </w:tc>
@@ -10784,7 +10819,7 @@
               <w:rPr>
                 <w:sz w:val="19"/>
               </w:rPr>
-              <w:t>-</w:t>
+              <w:t>2024</w:t>
             </w:r>
           </w:p>
         </w:tc>
@@ -10799,7 +10834,7 @@
               <w:rPr>
                 <w:sz w:val="19"/>
               </w:rPr>
-              <w:t>WRITE_CHECK/TX_INFER/FUCCI</w:t>
+              <w:t>WRITE_CHECK</w:t>
             </w:r>
           </w:p>
         </w:tc>
@@ -10812,6 +10847,60 @@
               <w:rPr>
                 <w:sz w:val="19"/>
               </w:rPr>
+              <w:t>WriteCheck 工具（无正式论文）</w:t>
+            </w:r>
+          </w:p>
+        </w:tc>
+        <w:tc>
+          <w:tcPr>
+            <w:tcW w:type="dxa" w:w="1701"/>
+          </w:tcPr>
+          <w:p>
+            <w:r>
+              <w:rPr>
+                <w:sz w:val="19"/>
+              </w:rPr>
+              <w:t>-</w:t>
+            </w:r>
+          </w:p>
+        </w:tc>
+        <w:tc>
+          <w:tcPr>
+            <w:tcW w:type="dxa" w:w="1134"/>
+          </w:tcPr>
+          <w:p>
+            <w:r>
+              <w:rPr>
+                <w:sz w:val="19"/>
+              </w:rPr>
+              <w:t>-</w:t>
+            </w:r>
+          </w:p>
+        </w:tc>
+      </w:tr>
+      <w:tr>
+        <w:tc>
+          <w:tcPr>
+            <w:tcW w:type="dxa" w:w="1984"/>
+          </w:tcPr>
+          <w:p>
+            <w:r>
+              <w:rPr>
+                <w:sz w:val="19"/>
+              </w:rPr>
+              <w:t>TX_INFER</w:t>
+            </w:r>
+          </w:p>
+        </w:tc>
+        <w:tc>
+          <w:tcPr>
+            <w:tcW w:type="dxa" w:w="3969"/>
+          </w:tcPr>
+          <w:p>
+            <w:r>
+              <w:rPr>
+                <w:sz w:val="19"/>
+              </w:rPr>
               <w:t>内部扩展</w:t>
             </w:r>
           </w:p>
@@ -10839,6 +10928,60 @@
                 <w:sz w:val="19"/>
               </w:rPr>
               <w:t>-</w:t>
+            </w:r>
+          </w:p>
+        </w:tc>
+      </w:tr>
+      <w:tr>
+        <w:tc>
+          <w:tcPr>
+            <w:tcW w:type="dxa" w:w="1984"/>
+          </w:tcPr>
+          <w:p>
+            <w:r>
+              <w:rPr>
+                <w:sz w:val="19"/>
+              </w:rPr>
+              <w:t>FUCCI</w:t>
+            </w:r>
+          </w:p>
+        </w:tc>
+        <w:tc>
+          <w:tcPr>
+            <w:tcW w:type="dxa" w:w="3969"/>
+          </w:tcPr>
+          <w:p>
+            <w:r>
+              <w:rPr>
+                <w:sz w:val="19"/>
+              </w:rPr>
+              <w:t>Fucci: Fuzzing Database Transactions with Random Conflict Construction and Multilevel Constraint Solving</w:t>
+            </w:r>
+          </w:p>
+        </w:tc>
+        <w:tc>
+          <w:tcPr>
+            <w:tcW w:type="dxa" w:w="1701"/>
+          </w:tcPr>
+          <w:p>
+            <w:r>
+              <w:rPr>
+                <w:sz w:val="19"/>
+              </w:rPr>
+              <w:t>ACM</w:t>
+            </w:r>
+          </w:p>
+        </w:tc>
+        <w:tc>
+          <w:tcPr>
+            <w:tcW w:type="dxa" w:w="1134"/>
+          </w:tcPr>
+          <w:p>
+            <w:r>
+              <w:rPr>
+                <w:sz w:val="19"/>
+              </w:rPr>
+              <w:t>2024</w:t>
             </w:r>
           </w:p>
         </w:tc>

</xml_diff>